<commit_message>
New use of CLI
new updates
</commit_message>
<xml_diff>
--- a/Puzzles Back Cover.docx
+++ b/Puzzles Back Cover.docx
@@ -4,217 +4,294 @@
   <w:body>
     <w:p>
       <w:pPr>
-        <w:rPr>
-          <w:sz w:val="32"/>
-          <w:szCs w:val="32"/>
-        </w:rPr>
-      </w:pPr>
-      <w:r>
-        <w:rPr>
-          <w:sz w:val="32"/>
-          <w:szCs w:val="32"/>
-        </w:rPr>
-        <w:t>This large-print word search book is designed for seniors and anyone looking for relaxing, easy-to-follow puzzles.</w:t>
-      </w:r>
-    </w:p>
-    <w:p>
-      <w:pPr>
-        <w:rPr>
-          <w:sz w:val="32"/>
-          <w:szCs w:val="32"/>
+        <w:spacing w:line="360" w:lineRule="auto"/>
+        <w:rPr>
+          <w:b/>
+          <w:bCs/>
+          <w:sz w:val="32"/>
+          <w:szCs w:val="32"/>
+          <w:lang w:val="en-CA"/>
         </w:rPr>
       </w:pPr>
     </w:p>
     <w:p>
       <w:pPr>
-        <w:rPr>
-          <w:sz w:val="32"/>
-          <w:szCs w:val="32"/>
+        <w:spacing w:line="360" w:lineRule="auto"/>
+        <w:rPr>
+          <w:b/>
+          <w:bCs/>
+          <w:sz w:val="32"/>
+          <w:szCs w:val="32"/>
+          <w:lang w:val="en-CA"/>
         </w:rPr>
       </w:pPr>
       <w:r>
         <w:rPr>
-          <w:sz w:val="32"/>
-          <w:szCs w:val="32"/>
-        </w:rPr>
-        <w:t>Inside you'll find:</w:t>
+          <w:b/>
+          <w:bCs/>
+          <w:sz w:val="32"/>
+          <w:szCs w:val="32"/>
+          <w:lang w:val="en-CA"/>
+        </w:rPr>
+        <w:t>Simple puzzles designed for an easier, more accessible experience.</w:t>
       </w:r>
     </w:p>
     <w:p>
       <w:pPr>
-        <w:rPr>
-          <w:sz w:val="32"/>
-          <w:szCs w:val="32"/>
+        <w:spacing w:line="360" w:lineRule="auto"/>
+        <w:rPr>
+          <w:sz w:val="32"/>
+          <w:szCs w:val="32"/>
+          <w:lang w:val="en-CA"/>
         </w:rPr>
       </w:pPr>
+      <w:r>
+        <w:rPr>
+          <w:sz w:val="32"/>
+          <w:szCs w:val="32"/>
+          <w:lang w:val="en-CA"/>
+        </w:rPr>
+        <w:t>Inside you'll find:</w:t>
+      </w:r>
     </w:p>
     <w:p>
       <w:pPr>
-        <w:rPr>
-          <w:sz w:val="32"/>
-          <w:szCs w:val="32"/>
+        <w:spacing w:line="360" w:lineRule="auto"/>
+        <w:rPr>
+          <w:sz w:val="32"/>
+          <w:szCs w:val="32"/>
+          <w:lang w:val="en-CA"/>
         </w:rPr>
       </w:pPr>
       <w:r>
         <w:rPr>
           <w:sz w:val="32"/>
           <w:szCs w:val="32"/>
-        </w:rPr>
-        <w:t xml:space="preserve">• 100 simple word search puzzles  </w:t>
+          <w:lang w:val="en-CA"/>
+        </w:rPr>
+        <w:t xml:space="preserve">• </w:t>
+      </w:r>
+      <w:r>
+        <w:rPr>
+          <w:b/>
+          <w:bCs/>
+          <w:sz w:val="32"/>
+          <w:szCs w:val="32"/>
+          <w:lang w:val="en-CA"/>
+        </w:rPr>
+        <w:t>100 simple word search puzzles</w:t>
+      </w:r>
+      <w:r>
+        <w:rPr>
+          <w:sz w:val="32"/>
+          <w:szCs w:val="32"/>
+          <w:lang w:val="en-CA"/>
+        </w:rPr>
+        <w:br/>
+        <w:t xml:space="preserve">• </w:t>
+      </w:r>
+      <w:r>
+        <w:rPr>
+          <w:b/>
+          <w:bCs/>
+          <w:sz w:val="32"/>
+          <w:szCs w:val="32"/>
+          <w:lang w:val="en-CA"/>
+        </w:rPr>
+        <w:t>Large, easy-to-read letters</w:t>
+      </w:r>
+      <w:r>
+        <w:rPr>
+          <w:sz w:val="32"/>
+          <w:szCs w:val="32"/>
+          <w:lang w:val="en-CA"/>
+        </w:rPr>
+        <w:br/>
+        <w:t xml:space="preserve">• </w:t>
+      </w:r>
+      <w:r>
+        <w:rPr>
+          <w:b/>
+          <w:bCs/>
+          <w:sz w:val="32"/>
+          <w:szCs w:val="32"/>
+          <w:lang w:val="en-CA"/>
+        </w:rPr>
+        <w:t>Short, familiar words — 7 letters or fewer</w:t>
+      </w:r>
+      <w:r>
+        <w:rPr>
+          <w:sz w:val="32"/>
+          <w:szCs w:val="32"/>
+          <w:lang w:val="en-CA"/>
+        </w:rPr>
+        <w:br/>
+        <w:t xml:space="preserve">• </w:t>
+      </w:r>
+      <w:r>
+        <w:rPr>
+          <w:b/>
+          <w:bCs/>
+          <w:sz w:val="32"/>
+          <w:szCs w:val="32"/>
+          <w:lang w:val="en-CA"/>
+        </w:rPr>
+        <w:t>Only 8 words to find in each puzzle</w:t>
+      </w:r>
+      <w:r>
+        <w:rPr>
+          <w:sz w:val="32"/>
+          <w:szCs w:val="32"/>
+          <w:lang w:val="en-CA"/>
+        </w:rPr>
+        <w:br/>
+        <w:t xml:space="preserve">• </w:t>
+      </w:r>
+      <w:r>
+        <w:rPr>
+          <w:b/>
+          <w:bCs/>
+          <w:sz w:val="32"/>
+          <w:szCs w:val="32"/>
+          <w:lang w:val="en-CA"/>
+        </w:rPr>
+        <w:t>One word per row, placed left to right only</w:t>
+      </w:r>
+      <w:r>
+        <w:rPr>
+          <w:sz w:val="32"/>
+          <w:szCs w:val="32"/>
+          <w:lang w:val="en-CA"/>
+        </w:rPr>
+        <w:br/>
+        <w:t xml:space="preserve">• </w:t>
+      </w:r>
+      <w:r>
+        <w:rPr>
+          <w:b/>
+          <w:bCs/>
+          <w:sz w:val="32"/>
+          <w:szCs w:val="32"/>
+          <w:lang w:val="en-CA"/>
+        </w:rPr>
+        <w:t>Clear, consistent puzzle layouts</w:t>
+      </w:r>
+      <w:r>
+        <w:rPr>
+          <w:sz w:val="32"/>
+          <w:szCs w:val="32"/>
+          <w:lang w:val="en-CA"/>
+        </w:rPr>
+        <w:br/>
+        <w:t xml:space="preserve">• </w:t>
+      </w:r>
+      <w:r>
+        <w:rPr>
+          <w:b/>
+          <w:bCs/>
+          <w:sz w:val="32"/>
+          <w:szCs w:val="32"/>
+          <w:lang w:val="en-CA"/>
+        </w:rPr>
+        <w:t>No extra or filler words</w:t>
+      </w:r>
+      <w:r>
+        <w:rPr>
+          <w:sz w:val="32"/>
+          <w:szCs w:val="32"/>
+          <w:lang w:val="en-CA"/>
+        </w:rPr>
+        <w:br/>
+        <w:t xml:space="preserve">• </w:t>
+      </w:r>
+      <w:r>
+        <w:rPr>
+          <w:b/>
+          <w:bCs/>
+          <w:sz w:val="32"/>
+          <w:szCs w:val="32"/>
+          <w:lang w:val="en-CA"/>
+        </w:rPr>
+        <w:t>Answer keys included</w:t>
       </w:r>
     </w:p>
     <w:p>
       <w:pPr>
-        <w:rPr>
-          <w:sz w:val="32"/>
-          <w:szCs w:val="32"/>
+        <w:spacing w:line="360" w:lineRule="auto"/>
+        <w:rPr>
+          <w:sz w:val="32"/>
+          <w:szCs w:val="32"/>
+          <w:lang w:val="en-CA"/>
         </w:rPr>
       </w:pPr>
       <w:r>
         <w:rPr>
           <w:sz w:val="32"/>
           <w:szCs w:val="32"/>
-        </w:rPr>
-        <w:t xml:space="preserve">• Large, easy-to-read letters  </w:t>
+          <w:lang w:val="en-CA"/>
+        </w:rPr>
+        <w:t>The puzzles use a simple, predictable format that makes them easy to follow without the complexity of traditional word searches.</w:t>
       </w:r>
     </w:p>
     <w:p>
       <w:pPr>
-        <w:rPr>
-          <w:sz w:val="32"/>
-          <w:szCs w:val="32"/>
+        <w:spacing w:line="360" w:lineRule="auto"/>
+        <w:rPr>
+          <w:sz w:val="32"/>
+          <w:szCs w:val="32"/>
+          <w:lang w:val="en-CA"/>
         </w:rPr>
       </w:pPr>
       <w:r>
         <w:rPr>
           <w:sz w:val="32"/>
           <w:szCs w:val="32"/>
-        </w:rPr>
-        <w:t xml:space="preserve">• Short, familiar words (7 letters or fewer)  </w:t>
+          <w:lang w:val="en-CA"/>
+        </w:rPr>
+        <w:t>Enjoy them independently or with a family member, friend, or caregiver.</w:t>
       </w:r>
     </w:p>
     <w:p>
       <w:pPr>
-        <w:rPr>
-          <w:sz w:val="32"/>
-          <w:szCs w:val="32"/>
+        <w:spacing w:line="360" w:lineRule="auto"/>
+        <w:rPr>
+          <w:sz w:val="32"/>
+          <w:szCs w:val="32"/>
+          <w:lang w:val="en-CA"/>
         </w:rPr>
       </w:pPr>
       <w:r>
         <w:rPr>
-          <w:sz w:val="32"/>
-          <w:szCs w:val="32"/>
-        </w:rPr>
-        <w:t xml:space="preserve">• One word per row, placed left to right only  </w:t>
+          <w:b/>
+          <w:bCs/>
+          <w:sz w:val="32"/>
+          <w:szCs w:val="32"/>
+          <w:lang w:val="en-CA"/>
+        </w:rPr>
+        <w:t>Take your time. There is no need to rush.</w:t>
       </w:r>
     </w:p>
     <w:p>
       <w:pPr>
-        <w:rPr>
-          <w:sz w:val="32"/>
-          <w:szCs w:val="32"/>
+        <w:spacing w:line="360" w:lineRule="auto"/>
+        <w:rPr>
+          <w:sz w:val="32"/>
+          <w:szCs w:val="32"/>
+          <w:lang w:val="en-CA"/>
         </w:rPr>
       </w:pPr>
       <w:r>
         <w:rPr>
-          <w:sz w:val="32"/>
-          <w:szCs w:val="32"/>
-        </w:rPr>
-        <w:t xml:space="preserve">• Clear and consistent puzzle layouts  </w:t>
+          <w:b/>
+          <w:bCs/>
+          <w:sz w:val="32"/>
+          <w:szCs w:val="32"/>
+          <w:lang w:val="en-CA"/>
+        </w:rPr>
+        <w:t>Puzzles by Riley</w:t>
       </w:r>
     </w:p>
-    <w:p>
-      <w:pPr>
-        <w:rPr>
-          <w:sz w:val="32"/>
-          <w:szCs w:val="32"/>
-        </w:rPr>
-      </w:pPr>
-    </w:p>
-    <w:p>
-      <w:pPr>
-        <w:rPr>
-          <w:sz w:val="32"/>
-          <w:szCs w:val="32"/>
-        </w:rPr>
-      </w:pPr>
-      <w:r>
-        <w:rPr>
-          <w:sz w:val="32"/>
-          <w:szCs w:val="32"/>
-        </w:rPr>
-        <w:t>These puzzles are designed to be straightforward, enjoyable, and frustration-free.</w:t>
-      </w:r>
-    </w:p>
-    <w:p>
-      <w:pPr>
-        <w:rPr>
-          <w:sz w:val="32"/>
-          <w:szCs w:val="32"/>
-        </w:rPr>
-      </w:pPr>
-    </w:p>
-    <w:p>
-      <w:pPr>
-        <w:rPr>
-          <w:sz w:val="32"/>
-          <w:szCs w:val="32"/>
-        </w:rPr>
-      </w:pPr>
-      <w:r>
-        <w:rPr>
-          <w:sz w:val="32"/>
-          <w:szCs w:val="32"/>
-        </w:rPr>
-        <w:t>Created to encourage relaxation, gentle mental stimulation, and fun—whether enjoyed independently or with support.</w:t>
-      </w:r>
-    </w:p>
-    <w:p>
-      <w:pPr>
-        <w:rPr>
-          <w:sz w:val="32"/>
-          <w:szCs w:val="32"/>
-        </w:rPr>
-      </w:pPr>
-    </w:p>
-    <w:p>
-      <w:pPr>
-        <w:rPr>
-          <w:sz w:val="32"/>
-          <w:szCs w:val="32"/>
-        </w:rPr>
-      </w:pPr>
-      <w:r>
-        <w:rPr>
-          <w:sz w:val="32"/>
-          <w:szCs w:val="32"/>
-        </w:rPr>
-        <w:t>Take your time, enjoy the process, and have fun!</w:t>
-      </w:r>
-    </w:p>
-    <w:p>
-      <w:pPr>
-        <w:rPr>
-          <w:sz w:val="32"/>
-          <w:szCs w:val="32"/>
-        </w:rPr>
-      </w:pPr>
-    </w:p>
-    <w:p>
-      <w:pPr>
-        <w:rPr>
-          <w:sz w:val="32"/>
-          <w:szCs w:val="32"/>
-        </w:rPr>
-      </w:pPr>
-      <w:r>
-        <w:rPr>
-          <w:sz w:val="32"/>
-          <w:szCs w:val="32"/>
-        </w:rPr>
-        <w:t>Puzzles by Riley</w:t>
-      </w:r>
-    </w:p>
+    <w:p/>
     <w:sectPr>
       <w:pgSz w:w="12240" w:h="15840"/>
       <w:pgMar w:top="1440" w:right="1440" w:bottom="1440" w:left="1440" w:header="720" w:footer="720" w:gutter="0"/>
@@ -985,7 +1062,6 @@
   <w:style w:type="character" w:default="1" w:styleId="DefaultParagraphFont">
     <w:name w:val="Default Paragraph Font"/>
     <w:uiPriority w:val="1"/>
-    <w:semiHidden/>
     <w:unhideWhenUsed/>
   </w:style>
   <w:style w:type="table" w:default="1" w:styleId="TableNormal">

</xml_diff>